<commit_message>
add class 23 for user authentication, foreignkey
</commit_message>
<xml_diff>
--- a/django/Demo Exam/Demonstration-02.docx
+++ b/django/Demo Exam/Demonstration-02.docx
@@ -267,7 +267,37 @@
           <w:sz w:val="24"/>
           <w:szCs w:val="24"/>
         </w:rPr>
-        <w:t>username, email</w:t>
+        <w:t>username,</w:t>
+      </w:r>
+      <w:r>
+        <w:rPr>
+          <w:sz w:val="24"/>
+          <w:szCs w:val="24"/>
+        </w:rPr>
+        <w:t xml:space="preserve"> </w:t>
+      </w:r>
+      <w:proofErr w:type="spellStart"/>
+      <w:r>
+        <w:rPr>
+          <w:sz w:val="24"/>
+          <w:szCs w:val="24"/>
+        </w:rPr>
+        <w:t>full_name</w:t>
+      </w:r>
+      <w:proofErr w:type="spellEnd"/>
+      <w:r>
+        <w:rPr>
+          <w:sz w:val="24"/>
+          <w:szCs w:val="24"/>
+        </w:rPr>
+        <w:t>,</w:t>
+      </w:r>
+      <w:r>
+        <w:rPr>
+          <w:sz w:val="24"/>
+          <w:szCs w:val="24"/>
+        </w:rPr>
+        <w:t xml:space="preserve"> email</w:t>
       </w:r>
       <w:proofErr w:type="gramStart"/>
       <w:r>
@@ -306,8 +336,24 @@
           <w:sz w:val="24"/>
           <w:szCs w:val="24"/>
         </w:rPr>
-        <w:t>). This data will be store on the Build-in User Model.</w:t>
-      </w:r>
+        <w:t>). This da</w:t>
+      </w:r>
+      <w:r>
+        <w:rPr>
+          <w:sz w:val="24"/>
+          <w:szCs w:val="24"/>
+        </w:rPr>
+        <w:t>ta will be store on the Custom</w:t>
+      </w:r>
+      <w:r>
+        <w:rPr>
+          <w:sz w:val="24"/>
+          <w:szCs w:val="24"/>
+        </w:rPr>
+        <w:t xml:space="preserve"> User Model.</w:t>
+      </w:r>
+      <w:bookmarkStart w:id="0" w:name="_GoBack"/>
+      <w:bookmarkEnd w:id="0"/>
     </w:p>
     <w:p>
       <w:pPr>
@@ -569,8 +615,6 @@
         </w:rPr>
         <w:t>Templates and Navigation:</w:t>
       </w:r>
-      <w:bookmarkStart w:id="0" w:name="_GoBack"/>
-      <w:bookmarkEnd w:id="0"/>
     </w:p>
     <w:p>
       <w:pPr>

</xml_diff>